<commit_message>
Add Vercel deployment config
</commit_message>
<xml_diff>
--- a/docs/reports/AfriSafeBench_Official_Template_4Page_Draft_v3.docx
+++ b/docs/reports/AfriSafeBench_Official_Template_4Page_Draft_v3.docx
@@ -23,9 +23,7 @@
         <w:br/>
         <w:t>University of St. Thomas, Minnesota</w:t>
         <w:br/>
-      </w:r>
-      <w:r>
-        <w:t>Hackathon track: Open Track | Project type: Evaluation + Tool</w:t>
+        <w:t>Regional Tracks: Track 4: Open | Sub-track: Evals and benchmarks and tool | Project type: Evaluation + Tool</w:t>
       </w:r>
     </w:p>
     <w:p>
@@ -80,6 +78,12 @@
       </w:r>
     </w:p>
     <w:p>
+      <w:pPr/>
+      <w:r>
+        <w:t>I reused only the basic application structure and LLM/API plumbing from an earlier independent compliance app that I had created before this hackathon began. During the hackathon, I built AfriSafeBench as a new AI safety benchmark and tool, including the scenario dataset, African healthcare risk taxonomy, scoring workflow, framework-guided report mode, and model comparison results.</w:t>
+      </w:r>
+    </w:p>
+    <w:p>
       <w:pPr>
         <w:pStyle w:val="Heading1"/>
       </w:pPr>
@@ -103,6 +107,14 @@
       </w:pPr>
       <w:r>
         <w:t>3. Methodology</w:t>
+      </w:r>
+    </w:p>
+    <w:p>
+      <w:pPr>
+        <w:pStyle w:val="Heading1"/>
+      </w:pPr>
+      <w:r>
+        <w:t>I reused the existing application structure and LLM/API plumbing where possible, but refactored the system into a new AI safety evaluation workflow for AfriSafeBench. The benchmark scenarios, risk categories, scoring logic, result compiler, framework-guided recommendation mode, and analysis artifacts were created for this hackathon.</w:t>
       </w:r>
     </w:p>
     <w:p>
@@ -790,7 +802,7 @@
         <w:pStyle w:val="Heading1"/>
       </w:pPr>
       <w:r>
-        <w:t>5. Discussion, Limitations</w:t>
+        <w:t>5. Discussion, Limitations, and Dual-Use Considerations</w:t>
       </w:r>
     </w:p>
     <w:p>
@@ -823,7 +835,19 @@
     </w:p>
     <w:p>
       <w:r>
-        <w:t>The work does not fully address multilingual deployment, real clinical workflows, country-specific legal requirements, or adversarial attempts to game the benchmark. The framework-guided report mode is not legal or clinical advice. A dual-use risk is that the benchmark could be used to train models to repeat category labels or produce superficial governance reports. Mitigations include requiring scenario-specific explanations, preserving missed-risk outputs, recording human-review flags, showing retrieved framework sources, and requiring expert review for real deployment decisions.</w:t>
+        <w:t>The work does not fully address multilingual deployment, real clinical workflows, country-specific legal requirements, or adversarial attempts to game the benchmark. The framework-guided report mode is not legal or clinical advice.</w:t>
+      </w:r>
+    </w:p>
+    <w:p>
+      <w:pPr/>
+      <w:r>
+        <w:t>Dual-Use Considerations</w:t>
+      </w:r>
+    </w:p>
+    <w:p>
+      <w:pPr/>
+      <w:r>
+        <w:t>A dual-use risk is that the benchmark could be used to train models to repeat category labels or produce superficial governance reports. Mitigations include requiring scenario-specific explanations, preserving missed-risk outputs, recording human-review flags, showing retrieved framework sources, and requiring expert review for real deployment decisions.</w:t>
       </w:r>
     </w:p>
     <w:p>

</xml_diff>